<commit_message>
New code to place R2 stats in the footnote. Bold any significant P-values, show all diagnostic stats (AIC)
</commit_message>
<xml_diff>
--- a/Output/final_log_regression_model_results.docx
+++ b/Output/final_log_regression_model_results.docx
@@ -135,6 +135,20 @@
               </w:rPr>
               <w:t xml:space="preserve">Characteristic</w:t>
             </w:r>
+            <w:r>
+              <w:rPr>
+                <w:rFonts w:ascii="Arial" w:hAnsi="Arial" w:eastAsia="Arial" w:cs="Arial"/>
+                <w:i w:val="false"/>
+                <w:b w:val="false"/>
+                <w:u w:val="none"/>
+                <w:strike w:val="false"/>
+                <w:vertAlign w:val="superscript"/>
+                <w:sz w:val="22"/>
+                <w:szCs w:val="22"/>
+                <w:color w:val="000000"/>
+              </w:rPr>
+              <w:t xml:space="preserve">1</w:t>
+            </w:r>
           </w:p>
         </w:tc>
         <w:tc>
@@ -6976,11 +6990,147 @@
                 <w:b w:val="false"/>
                 <w:u w:val="none"/>
                 <w:strike w:val="false"/>
+                <w:vertAlign w:val="superscript"/>
+                <w:sz w:val="22"/>
+                <w:szCs w:val="22"/>
+                <w:color w:val="000000"/>
+              </w:rPr>
+              <w:t xml:space="preserve">1</w:t>
+            </w:r>
+            <w:r>
+              <w:rPr>
+                <w:rFonts w:ascii="Arial" w:hAnsi="Arial" w:eastAsia="Arial" w:cs="Arial"/>
+                <w:i w:val="false"/>
+                <w:b w:val="false"/>
+                <w:u w:val="none"/>
+                <w:strike w:val="false"/>
+                <w:sz w:val="22"/>
+                <w:szCs w:val="22"/>
+                <w:color w:val="000000"/>
+              </w:rPr>
+              <w:t xml:space="preserve">Model fit: Marginal R² = 0.043, Conditional R² = 0.786</w:t>
+            </w:r>
+          </w:p>
+        </w:tc>
+      </w:tr>
+      <w:tr>
+        <w:trPr>
+          <w:trHeight w:val="360" w:hRule="auto"/>
+        </w:trPr>
+        footer 2
+        <w:tc>
+          <w:tcPr>
+            <w:gridSpan w:val="5"/>
+            <w:tcBorders>
+              <w:bottom w:val="none" w:sz="0" w:space="0" w:color="FFFFFF"/>
+              <w:top w:val="none" w:sz="0" w:space="0" w:color="FFFFFF"/>
+              <w:left w:val="none" w:sz="0" w:space="0" w:color="FFFFFF"/>
+              <w:right w:val="none" w:sz="0" w:space="0" w:color="FFFFFF"/>
+            </w:tcBorders>
+            <w:shd w:val="clear" w:color="auto" w:fill="FFFFFF"/>
+            <w:tcMar>
+              <w:top w:w="0" w:type="dxa"/>
+              <w:bottom w:w="0" w:type="dxa"/>
+              <w:left w:w="0" w:type="dxa"/>
+              <w:right w:w="0" w:type="dxa"/>
+            </w:tcMar>
+            <w:vAlign w:val="center"/>
+          </w:tcPr>
+          <w:p>
+            <w:pPr>
+              <w:jc w:val="left"/>
+              <w:pBdr>
+                <w:bottom w:val="none" w:sz="0" w:space="0" w:color="000000"/>
+                <w:top w:val="none" w:sz="0" w:space="0" w:color="000000"/>
+                <w:left w:val="none" w:sz="0" w:space="0" w:color="000000"/>
+                <w:right w:val="none" w:sz="0" w:space="0" w:color="000000"/>
+              </w:pBdr>
+              <w:spacing w:after="100" w:before="100" w:line="240"/>
+              <w:ind w:left="100" w:right="100" w:firstLine="0" w:firstLineChars="0"/>
+              <w:rPr>
+                <w:rFonts w:ascii="Arial" w:hAnsi="Arial" w:eastAsia="Arial" w:cs="Arial"/>
+                <w:i w:val="false"/>
+                <w:b w:val="false"/>
+                <w:u w:val="none"/>
+                <w:strike w:val="false"/>
+                <w:sz w:val="22"/>
+                <w:szCs w:val="22"/>
+                <w:color w:val="000000"/>
+              </w:rPr>
+            </w:pPr>
+            <w:r>
+              <w:rPr>
+                <w:rFonts w:ascii="Arial" w:hAnsi="Arial" w:eastAsia="Arial" w:cs="Arial"/>
+                <w:i w:val="false"/>
+                <w:b w:val="false"/>
+                <w:u w:val="none"/>
+                <w:strike w:val="false"/>
                 <w:sz w:val="22"/>
                 <w:szCs w:val="22"/>
                 <w:color w:val="000000"/>
               </w:rPr>
               <w:t xml:space="preserve">Abbreviation: CI = Confidence Interval</w:t>
+            </w:r>
+          </w:p>
+        </w:tc>
+      </w:tr>
+      <w:tr>
+        <w:trPr>
+          <w:trHeight w:val="360" w:hRule="auto"/>
+        </w:trPr>
+        footer 3
+        <w:tc>
+          <w:tcPr>
+            <w:gridSpan w:val="5"/>
+            <w:tcBorders>
+              <w:bottom w:val="none" w:sz="0" w:space="0" w:color="FFFFFF"/>
+              <w:top w:val="none" w:sz="0" w:space="0" w:color="FFFFFF"/>
+              <w:left w:val="none" w:sz="0" w:space="0" w:color="FFFFFF"/>
+              <w:right w:val="none" w:sz="0" w:space="0" w:color="FFFFFF"/>
+            </w:tcBorders>
+            <w:shd w:val="clear" w:color="auto" w:fill="FFFFFF"/>
+            <w:tcMar>
+              <w:top w:w="0" w:type="dxa"/>
+              <w:bottom w:w="0" w:type="dxa"/>
+              <w:left w:w="0" w:type="dxa"/>
+              <w:right w:w="0" w:type="dxa"/>
+            </w:tcMar>
+            <w:vAlign w:val="center"/>
+          </w:tcPr>
+          <w:p>
+            <w:pPr>
+              <w:jc w:val="left"/>
+              <w:pBdr>
+                <w:bottom w:val="none" w:sz="0" w:space="0" w:color="000000"/>
+                <w:top w:val="none" w:sz="0" w:space="0" w:color="000000"/>
+                <w:left w:val="none" w:sz="0" w:space="0" w:color="000000"/>
+                <w:right w:val="none" w:sz="0" w:space="0" w:color="000000"/>
+              </w:pBdr>
+              <w:spacing w:after="100" w:before="100" w:line="240"/>
+              <w:ind w:left="100" w:right="100" w:firstLine="0" w:firstLineChars="0"/>
+              <w:rPr>
+                <w:rFonts w:ascii="Arial" w:hAnsi="Arial" w:eastAsia="Arial" w:cs="Arial"/>
+                <w:i w:val="false"/>
+                <w:b w:val="false"/>
+                <w:u w:val="none"/>
+                <w:strike w:val="false"/>
+                <w:sz w:val="22"/>
+                <w:szCs w:val="22"/>
+                <w:color w:val="000000"/>
+              </w:rPr>
+            </w:pPr>
+            <w:r>
+              <w:rPr>
+                <w:rFonts w:ascii="Arial" w:hAnsi="Arial" w:eastAsia="Arial" w:cs="Arial"/>
+                <w:i w:val="false"/>
+                <w:b w:val="false"/>
+                <w:u w:val="none"/>
+                <w:strike w:val="false"/>
+                <w:sz w:val="22"/>
+                <w:szCs w:val="22"/>
+                <w:color w:val="000000"/>
+              </w:rPr>
+              <w:t xml:space="preserve">No. Obs. = 41,843; Sigma = 1.00; Log-likelihood = -7,951; AIC = 15,942; BIC = 16,115; Deviance = 14,511; Residual df = 41,823</w:t>
             </w:r>
           </w:p>
         </w:tc>

</xml_diff>

<commit_message>
New log regression with updates to footnotes and text customization
</commit_message>
<xml_diff>
--- a/Output/final_log_regression_model_results.docx
+++ b/Output/final_log_regression_model_results.docx
@@ -566,19 +566,19 @@
               <w:rPr>
                 <w:rFonts w:ascii="Arial" w:hAnsi="Arial" w:eastAsia="Arial" w:cs="Arial"/>
                 <w:i w:val="false"/>
-                <w:b w:val="false"/>
-                <w:u w:val="none"/>
-                <w:strike w:val="false"/>
-                <w:sz w:val="22"/>
-                <w:szCs w:val="22"/>
-                <w:color w:val="000000"/>
-              </w:rPr>
-            </w:pPr>
-            <w:r>
-              <w:rPr>
-                <w:rFonts w:ascii="Arial" w:hAnsi="Arial" w:eastAsia="Arial" w:cs="Arial"/>
-                <w:i w:val="false"/>
-                <w:b w:val="false"/>
+                <w:b w:val="true"/>
+                <w:u w:val="none"/>
+                <w:strike w:val="false"/>
+                <w:sz w:val="22"/>
+                <w:szCs w:val="22"/>
+                <w:color w:val="000000"/>
+              </w:rPr>
+            </w:pPr>
+            <w:r>
+              <w:rPr>
+                <w:rFonts w:ascii="Arial" w:hAnsi="Arial" w:eastAsia="Arial" w:cs="Arial"/>
+                <w:i w:val="false"/>
+                <w:b w:val="true"/>
                 <w:u w:val="none"/>
                 <w:strike w:val="false"/>
                 <w:sz w:val="22"/>
@@ -842,19 +842,19 @@
               <w:rPr>
                 <w:rFonts w:ascii="Arial" w:hAnsi="Arial" w:eastAsia="Arial" w:cs="Arial"/>
                 <w:i w:val="false"/>
-                <w:b w:val="false"/>
-                <w:u w:val="none"/>
-                <w:strike w:val="false"/>
-                <w:sz w:val="22"/>
-                <w:szCs w:val="22"/>
-                <w:color w:val="000000"/>
-              </w:rPr>
-            </w:pPr>
-            <w:r>
-              <w:rPr>
-                <w:rFonts w:ascii="Arial" w:hAnsi="Arial" w:eastAsia="Arial" w:cs="Arial"/>
-                <w:i w:val="false"/>
-                <w:b w:val="false"/>
+                <w:b w:val="true"/>
+                <w:u w:val="none"/>
+                <w:strike w:val="false"/>
+                <w:sz w:val="22"/>
+                <w:szCs w:val="22"/>
+                <w:color w:val="000000"/>
+              </w:rPr>
+            </w:pPr>
+            <w:r>
+              <w:rPr>
+                <w:rFonts w:ascii="Arial" w:hAnsi="Arial" w:eastAsia="Arial" w:cs="Arial"/>
+                <w:i w:val="false"/>
+                <w:b w:val="true"/>
                 <w:u w:val="none"/>
                 <w:strike w:val="false"/>
                 <w:sz w:val="22"/>
@@ -4982,19 +4982,19 @@
               <w:rPr>
                 <w:rFonts w:ascii="Arial" w:hAnsi="Arial" w:eastAsia="Arial" w:cs="Arial"/>
                 <w:i w:val="false"/>
-                <w:b w:val="false"/>
-                <w:u w:val="none"/>
-                <w:strike w:val="false"/>
-                <w:sz w:val="22"/>
-                <w:szCs w:val="22"/>
-                <w:color w:val="000000"/>
-              </w:rPr>
-            </w:pPr>
-            <w:r>
-              <w:rPr>
-                <w:rFonts w:ascii="Arial" w:hAnsi="Arial" w:eastAsia="Arial" w:cs="Arial"/>
-                <w:i w:val="false"/>
-                <w:b w:val="false"/>
+                <w:b w:val="true"/>
+                <w:u w:val="none"/>
+                <w:strike w:val="false"/>
+                <w:sz w:val="22"/>
+                <w:szCs w:val="22"/>
+                <w:color w:val="000000"/>
+              </w:rPr>
+            </w:pPr>
+            <w:r>
+              <w:rPr>
+                <w:rFonts w:ascii="Arial" w:hAnsi="Arial" w:eastAsia="Arial" w:cs="Arial"/>
+                <w:i w:val="false"/>
+                <w:b w:val="true"/>
                 <w:u w:val="none"/>
                 <w:strike w:val="false"/>
                 <w:sz w:val="22"/>
@@ -5258,19 +5258,19 @@
               <w:rPr>
                 <w:rFonts w:ascii="Arial" w:hAnsi="Arial" w:eastAsia="Arial" w:cs="Arial"/>
                 <w:i w:val="false"/>
-                <w:b w:val="false"/>
-                <w:u w:val="none"/>
-                <w:strike w:val="false"/>
-                <w:sz w:val="22"/>
-                <w:szCs w:val="22"/>
-                <w:color w:val="000000"/>
-              </w:rPr>
-            </w:pPr>
-            <w:r>
-              <w:rPr>
-                <w:rFonts w:ascii="Arial" w:hAnsi="Arial" w:eastAsia="Arial" w:cs="Arial"/>
-                <w:i w:val="false"/>
-                <w:b w:val="false"/>
+                <w:b w:val="true"/>
+                <w:u w:val="none"/>
+                <w:strike w:val="false"/>
+                <w:sz w:val="22"/>
+                <w:szCs w:val="22"/>
+                <w:color w:val="000000"/>
+              </w:rPr>
+            </w:pPr>
+            <w:r>
+              <w:rPr>
+                <w:rFonts w:ascii="Arial" w:hAnsi="Arial" w:eastAsia="Arial" w:cs="Arial"/>
+                <w:i w:val="false"/>
+                <w:b w:val="true"/>
                 <w:u w:val="none"/>
                 <w:strike w:val="false"/>
                 <w:sz w:val="22"/>
@@ -5534,19 +5534,19 @@
               <w:rPr>
                 <w:rFonts w:ascii="Arial" w:hAnsi="Arial" w:eastAsia="Arial" w:cs="Arial"/>
                 <w:i w:val="false"/>
-                <w:b w:val="false"/>
-                <w:u w:val="none"/>
-                <w:strike w:val="false"/>
-                <w:sz w:val="22"/>
-                <w:szCs w:val="22"/>
-                <w:color w:val="000000"/>
-              </w:rPr>
-            </w:pPr>
-            <w:r>
-              <w:rPr>
-                <w:rFonts w:ascii="Arial" w:hAnsi="Arial" w:eastAsia="Arial" w:cs="Arial"/>
-                <w:i w:val="false"/>
-                <w:b w:val="false"/>
+                <w:b w:val="true"/>
+                <w:u w:val="none"/>
+                <w:strike w:val="false"/>
+                <w:sz w:val="22"/>
+                <w:szCs w:val="22"/>
+                <w:color w:val="000000"/>
+              </w:rPr>
+            </w:pPr>
+            <w:r>
+              <w:rPr>
+                <w:rFonts w:ascii="Arial" w:hAnsi="Arial" w:eastAsia="Arial" w:cs="Arial"/>
+                <w:i w:val="false"/>
+                <w:b w:val="true"/>
                 <w:u w:val="none"/>
                 <w:strike w:val="false"/>
                 <w:sz w:val="22"/>
@@ -6914,19 +6914,19 @@
               <w:rPr>
                 <w:rFonts w:ascii="Arial" w:hAnsi="Arial" w:eastAsia="Arial" w:cs="Arial"/>
                 <w:i w:val="false"/>
-                <w:b w:val="false"/>
-                <w:u w:val="none"/>
-                <w:strike w:val="false"/>
-                <w:sz w:val="22"/>
-                <w:szCs w:val="22"/>
-                <w:color w:val="000000"/>
-              </w:rPr>
-            </w:pPr>
-            <w:r>
-              <w:rPr>
-                <w:rFonts w:ascii="Arial" w:hAnsi="Arial" w:eastAsia="Arial" w:cs="Arial"/>
-                <w:i w:val="false"/>
-                <w:b w:val="false"/>
+                <w:b w:val="true"/>
+                <w:u w:val="none"/>
+                <w:strike w:val="false"/>
+                <w:sz w:val="22"/>
+                <w:szCs w:val="22"/>
+                <w:color w:val="000000"/>
+              </w:rPr>
+            </w:pPr>
+            <w:r>
+              <w:rPr>
+                <w:rFonts w:ascii="Arial" w:hAnsi="Arial" w:eastAsia="Arial" w:cs="Arial"/>
+                <w:i w:val="false"/>
+                <w:b w:val="true"/>
                 <w:u w:val="none"/>
                 <w:strike w:val="false"/>
                 <w:sz w:val="22"/>

</xml_diff>